<commit_message>
Generate hospital significance breakdown from outputs; keep oral-only sensitivity out of Table 3; qualify SCMD data status
Co-Authored-By: Claude Opus 5 <noreply@anthropic.com>
Claude-Session: https://claude.ai/code/session_01PkNMwEKitkq1tP96RKxYsX
</commit_message>
<xml_diff>
--- a/paper/manuscript.docx
+++ b/paper/manuscript.docx
@@ -6234,7 +6234,7 @@
         <w:pStyle w:val="BodyText"/>
       </w:pPr>
       <w:r>
-        <w:t xml:space="preserve">Poisson PML with area and year fixed effects, adjusted for age structure, international in-migration, HIV and diabetes prevalence (diabetes not adjusted for metformin and insulins); SEs clustered by area. Joint model: prescribing in t−1 and t+1 in one model on a common sample; because the two are highly correlated within areas, their estimates are negatively correlated and opposite signs can arise by chance. PAF, largest population attributable fraction compatible with the upper 90% confidence limit; prevented fraction, the same from the lower 90% limit; in brackets, the PAF after dividing the upper limit by the negative control (levothyroxine) estimate, as if its bias applied to every drug.</w:t>
+        <w:t xml:space="preserve">Poisson PML with area and year fixed effects, adjusted for age structure, international in-migration, HIV and diabetes prevalence (diabetes not adjusted for metformin and insulins); SEs clustered by area. Joint model: prescribing in t−1 and t+1 in one model on a common sample; their estimates can be negatively correlated (Table S2b gives the correlation and the model with year t added). PAF, largest population attributable fraction compatible with the upper 90% confidence limit; prevented fraction, the same from the lower 90% limit; in brackets, the PAF after dividing the upper limit by the negative control (levothyroxine) estimate, as if its bias applied to every drug.</w:t>
       </w:r>
     </w:p>
     <w:p>
@@ -7255,7 +7255,7 @@
         </w:numPr>
       </w:pPr>
       <w:r>
-        <w:t xml:space="preserve">Across all 260 within-area hospital estimates at both levels, 22 were nominally significant: 12 for the two TB treatment groups (the expected same-year association), 7 for JAK inhibitors (inverse) and 3 for systemic glucocorticoids.</w:t>
+        <w:t xml:space="preserve">Across all 260 within-area hospital estimates at both levels, 22 were nominally significant: 12 for the two TB treatment groups (the expected same-year association), 7 for JAK inhibitors (inverse), 3 for systemic glucocorticoids and 0 for other groups.</w:t>
       </w:r>
     </w:p>
     <w:p>
@@ -8316,79 +8316,79 @@
               <w:jc w:val="right"/>
             </w:pPr>
             <w:r>
-              <w:t xml:space="preserve">Systemic glucocorticoids, oral forms only (sensitivity)</w:t>
-            </w:r>
-          </w:p>
-        </w:tc>
-        <w:tc>
-          <w:tcPr/>
-          <w:p>
-            <w:pPr>
-              <w:pStyle w:val="Compact"/>
-              <w:jc w:val="right"/>
-            </w:pPr>
-            <w:r>
-              <w:t xml:space="preserve">0.971 (0.930–1.012)</w:t>
-            </w:r>
-          </w:p>
-        </w:tc>
-        <w:tc>
-          <w:tcPr/>
-          <w:p>
-            <w:pPr>
-              <w:pStyle w:val="Compact"/>
-              <w:jc w:val="right"/>
-            </w:pPr>
-            <w:r>
-              <w:t xml:space="preserve">0.997 (0.979–1.016)</w:t>
-            </w:r>
-          </w:p>
-        </w:tc>
-        <w:tc>
-          <w:tcPr/>
-          <w:p>
-            <w:pPr>
-              <w:pStyle w:val="Compact"/>
-              <w:jc w:val="right"/>
-            </w:pPr>
-            <w:r>
-              <w:t xml:space="preserve">-0.03</w:t>
-            </w:r>
-          </w:p>
-        </w:tc>
-        <w:tc>
-          <w:tcPr/>
-          <w:p>
-            <w:pPr>
-              <w:pStyle w:val="Compact"/>
-              <w:jc w:val="right"/>
-            </w:pPr>
-            <w:r>
-              <w:t xml:space="preserve">1.011 (0.991–1.032)</w:t>
-            </w:r>
-          </w:p>
-        </w:tc>
-        <w:tc>
-          <w:tcPr/>
-          <w:p>
-            <w:pPr>
-              <w:pStyle w:val="Compact"/>
-              <w:jc w:val="right"/>
-            </w:pPr>
-            <w:r>
-              <w:t xml:space="preserve">1.011 (0.990–1.033)</w:t>
-            </w:r>
-          </w:p>
-        </w:tc>
-        <w:tc>
-          <w:tcPr/>
-          <w:p>
-            <w:pPr>
-              <w:pStyle w:val="Compact"/>
-              <w:jc w:val="right"/>
-            </w:pPr>
-            <w:r>
-              <w:t xml:space="preserve">0.983 (0.944–1.023)</w:t>
+              <w:t xml:space="preserve">Dexamethasone and hydrocortisone (descriptive)</w:t>
+            </w:r>
+          </w:p>
+        </w:tc>
+        <w:tc>
+          <w:tcPr/>
+          <w:p>
+            <w:pPr>
+              <w:pStyle w:val="Compact"/>
+              <w:jc w:val="right"/>
+            </w:pPr>
+            <w:r>
+              <w:t xml:space="preserve">0.934 (0.893–0.976)</w:t>
+            </w:r>
+          </w:p>
+        </w:tc>
+        <w:tc>
+          <w:tcPr/>
+          <w:p>
+            <w:pPr>
+              <w:pStyle w:val="Compact"/>
+              <w:jc w:val="right"/>
+            </w:pPr>
+            <w:r>
+              <w:t xml:space="preserve">1.005 (0.977–1.034)</w:t>
+            </w:r>
+          </w:p>
+        </w:tc>
+        <w:tc>
+          <w:tcPr/>
+          <w:p>
+            <w:pPr>
+              <w:pStyle w:val="Compact"/>
+              <w:jc w:val="right"/>
+            </w:pPr>
+            <w:r>
+              <w:t xml:space="preserve">0.05</w:t>
+            </w:r>
+          </w:p>
+        </w:tc>
+        <w:tc>
+          <w:tcPr/>
+          <w:p>
+            <w:pPr>
+              <w:pStyle w:val="Compact"/>
+              <w:jc w:val="right"/>
+            </w:pPr>
+            <w:r>
+              <w:t xml:space="preserve">1.008 (0.980–1.036)</w:t>
+            </w:r>
+          </w:p>
+        </w:tc>
+        <w:tc>
+          <w:tcPr/>
+          <w:p>
+            <w:pPr>
+              <w:pStyle w:val="Compact"/>
+              <w:jc w:val="right"/>
+            </w:pPr>
+            <w:r>
+              <w:t xml:space="preserve">1.008 (0.979–1.037)</w:t>
+            </w:r>
+          </w:p>
+        </w:tc>
+        <w:tc>
+          <w:tcPr/>
+          <w:p>
+            <w:pPr>
+              <w:pStyle w:val="Compact"/>
+              <w:jc w:val="right"/>
+            </w:pPr>
+            <w:r>
+              <w:t xml:space="preserve">0.994 (0.943–1.047)</w:t>
             </w:r>
           </w:p>
         </w:tc>
@@ -8414,31 +8414,31 @@
               <w:jc w:val="right"/>
             </w:pPr>
             <w:r>
-              <w:t xml:space="preserve">Dexamethasone and hydrocortisone (descriptive)</w:t>
-            </w:r>
-          </w:p>
-        </w:tc>
-        <w:tc>
-          <w:tcPr/>
-          <w:p>
-            <w:pPr>
-              <w:pStyle w:val="Compact"/>
-              <w:jc w:val="right"/>
-            </w:pPr>
-            <w:r>
-              <w:t xml:space="preserve">0.934 (0.893–0.976)</w:t>
-            </w:r>
-          </w:p>
-        </w:tc>
-        <w:tc>
-          <w:tcPr/>
-          <w:p>
-            <w:pPr>
-              <w:pStyle w:val="Compact"/>
-              <w:jc w:val="right"/>
-            </w:pPr>
-            <w:r>
-              <w:t xml:space="preserve">1.005 (0.977–1.034)</w:t>
+              <w:t xml:space="preserve">Low-TB-risk biologics (negative control)</w:t>
+            </w:r>
+          </w:p>
+        </w:tc>
+        <w:tc>
+          <w:tcPr/>
+          <w:p>
+            <w:pPr>
+              <w:pStyle w:val="Compact"/>
+              <w:jc w:val="right"/>
+            </w:pPr>
+            <w:r>
+              <w:t xml:space="preserve">1.014 (0.961–1.070)</w:t>
+            </w:r>
+          </w:p>
+        </w:tc>
+        <w:tc>
+          <w:tcPr/>
+          <w:p>
+            <w:pPr>
+              <w:pStyle w:val="Compact"/>
+              <w:jc w:val="right"/>
+            </w:pPr>
+            <w:r>
+              <w:t xml:space="preserve">1.004 (0.990–1.019)</w:t>
             </w:r>
           </w:p>
         </w:tc>
@@ -8462,31 +8462,31 @@
               <w:jc w:val="right"/>
             </w:pPr>
             <w:r>
-              <w:t xml:space="preserve">1.008 (0.980–1.036)</w:t>
-            </w:r>
-          </w:p>
-        </w:tc>
-        <w:tc>
-          <w:tcPr/>
-          <w:p>
-            <w:pPr>
-              <w:pStyle w:val="Compact"/>
-              <w:jc w:val="right"/>
-            </w:pPr>
-            <w:r>
-              <w:t xml:space="preserve">1.008 (0.979–1.037)</w:t>
-            </w:r>
-          </w:p>
-        </w:tc>
-        <w:tc>
-          <w:tcPr/>
-          <w:p>
-            <w:pPr>
-              <w:pStyle w:val="Compact"/>
-              <w:jc w:val="right"/>
-            </w:pPr>
-            <w:r>
-              <w:t xml:space="preserve">0.994 (0.943–1.047)</w:t>
+              <w:t xml:space="preserve">1.002 (0.986–1.018)</w:t>
+            </w:r>
+          </w:p>
+        </w:tc>
+        <w:tc>
+          <w:tcPr/>
+          <w:p>
+            <w:pPr>
+              <w:pStyle w:val="Compact"/>
+              <w:jc w:val="right"/>
+            </w:pPr>
+            <w:r>
+              <w:t xml:space="preserve">1.002 (0.983–1.021)</w:t>
+            </w:r>
+          </w:p>
+        </w:tc>
+        <w:tc>
+          <w:tcPr/>
+          <w:p>
+            <w:pPr>
+              <w:pStyle w:val="Compact"/>
+              <w:jc w:val="right"/>
+            </w:pPr>
+            <w:r>
+              <w:t xml:space="preserve">1.010 (0.982–1.040)</w:t>
             </w:r>
           </w:p>
         </w:tc>
@@ -8512,79 +8512,79 @@
               <w:jc w:val="right"/>
             </w:pPr>
             <w:r>
-              <w:t xml:space="preserve">Low-TB-risk biologics (negative control)</w:t>
-            </w:r>
-          </w:p>
-        </w:tc>
-        <w:tc>
-          <w:tcPr/>
-          <w:p>
-            <w:pPr>
-              <w:pStyle w:val="Compact"/>
-              <w:jc w:val="right"/>
-            </w:pPr>
-            <w:r>
-              <w:t xml:space="preserve">1.014 (0.961–1.070)</w:t>
-            </w:r>
-          </w:p>
-        </w:tc>
-        <w:tc>
-          <w:tcPr/>
-          <w:p>
-            <w:pPr>
-              <w:pStyle w:val="Compact"/>
-              <w:jc w:val="right"/>
-            </w:pPr>
-            <w:r>
-              <w:t xml:space="preserve">1.004 (0.990–1.019)</w:t>
-            </w:r>
-          </w:p>
-        </w:tc>
-        <w:tc>
-          <w:tcPr/>
-          <w:p>
-            <w:pPr>
-              <w:pStyle w:val="Compact"/>
-              <w:jc w:val="right"/>
-            </w:pPr>
-            <w:r>
-              <w:t xml:space="preserve">0.05</w:t>
-            </w:r>
-          </w:p>
-        </w:tc>
-        <w:tc>
-          <w:tcPr/>
-          <w:p>
-            <w:pPr>
-              <w:pStyle w:val="Compact"/>
-              <w:jc w:val="right"/>
-            </w:pPr>
-            <w:r>
-              <w:t xml:space="preserve">1.002 (0.986–1.018)</w:t>
-            </w:r>
-          </w:p>
-        </w:tc>
-        <w:tc>
-          <w:tcPr/>
-          <w:p>
-            <w:pPr>
-              <w:pStyle w:val="Compact"/>
-              <w:jc w:val="right"/>
-            </w:pPr>
-            <w:r>
-              <w:t xml:space="preserve">1.002 (0.983–1.021)</w:t>
-            </w:r>
-          </w:p>
-        </w:tc>
-        <w:tc>
-          <w:tcPr/>
-          <w:p>
-            <w:pPr>
-              <w:pStyle w:val="Compact"/>
-              <w:jc w:val="right"/>
-            </w:pPr>
-            <w:r>
-              <w:t xml:space="preserve">1.010 (0.982–1.040)</w:t>
+              <w:t xml:space="preserve">Levetiracetam (negative control)</w:t>
+            </w:r>
+          </w:p>
+        </w:tc>
+        <w:tc>
+          <w:tcPr/>
+          <w:p>
+            <w:pPr>
+              <w:pStyle w:val="Compact"/>
+              <w:jc w:val="right"/>
+            </w:pPr>
+            <w:r>
+              <w:t xml:space="preserve">1.017 (0.970–1.066)</w:t>
+            </w:r>
+          </w:p>
+        </w:tc>
+        <w:tc>
+          <w:tcPr/>
+          <w:p>
+            <w:pPr>
+              <w:pStyle w:val="Compact"/>
+              <w:jc w:val="right"/>
+            </w:pPr>
+            <w:r>
+              <w:t xml:space="preserve">0.998 (0.975–1.021)</w:t>
+            </w:r>
+          </w:p>
+        </w:tc>
+        <w:tc>
+          <w:tcPr/>
+          <w:p>
+            <w:pPr>
+              <w:pStyle w:val="Compact"/>
+              <w:jc w:val="right"/>
+            </w:pPr>
+            <w:r>
+              <w:t xml:space="preserve">-0.03</w:t>
+            </w:r>
+          </w:p>
+        </w:tc>
+        <w:tc>
+          <w:tcPr/>
+          <w:p>
+            <w:pPr>
+              <w:pStyle w:val="Compact"/>
+              <w:jc w:val="right"/>
+            </w:pPr>
+            <w:r>
+              <w:t xml:space="preserve">1.014 (0.986–1.042)</w:t>
+            </w:r>
+          </w:p>
+        </w:tc>
+        <w:tc>
+          <w:tcPr/>
+          <w:p>
+            <w:pPr>
+              <w:pStyle w:val="Compact"/>
+              <w:jc w:val="right"/>
+            </w:pPr>
+            <w:r>
+              <w:t xml:space="preserve">1.014 (0.986–1.042)</w:t>
+            </w:r>
+          </w:p>
+        </w:tc>
+        <w:tc>
+          <w:tcPr/>
+          <w:p>
+            <w:pPr>
+              <w:pStyle w:val="Compact"/>
+              <w:jc w:val="right"/>
+            </w:pPr>
+            <w:r>
+              <w:t xml:space="preserve">0.987 (0.948–1.028)</w:t>
             </w:r>
           </w:p>
         </w:tc>
@@ -8598,91 +8598,91 @@
               <w:jc w:val="left"/>
             </w:pPr>
             <w:r>
-              <w:t xml:space="preserve">UTLA</w:t>
-            </w:r>
-          </w:p>
-        </w:tc>
-        <w:tc>
-          <w:tcPr/>
-          <w:p>
-            <w:pPr>
-              <w:pStyle w:val="Compact"/>
-              <w:jc w:val="right"/>
-            </w:pPr>
-            <w:r>
-              <w:t xml:space="preserve">Levetiracetam (negative control)</w:t>
-            </w:r>
-          </w:p>
-        </w:tc>
-        <w:tc>
-          <w:tcPr/>
-          <w:p>
-            <w:pPr>
-              <w:pStyle w:val="Compact"/>
-              <w:jc w:val="right"/>
-            </w:pPr>
-            <w:r>
-              <w:t xml:space="preserve">1.017 (0.970–1.066)</w:t>
-            </w:r>
-          </w:p>
-        </w:tc>
-        <w:tc>
-          <w:tcPr/>
-          <w:p>
-            <w:pPr>
-              <w:pStyle w:val="Compact"/>
-              <w:jc w:val="right"/>
-            </w:pPr>
-            <w:r>
-              <w:t xml:space="preserve">0.998 (0.975–1.021)</w:t>
-            </w:r>
-          </w:p>
-        </w:tc>
-        <w:tc>
-          <w:tcPr/>
-          <w:p>
-            <w:pPr>
-              <w:pStyle w:val="Compact"/>
-              <w:jc w:val="right"/>
-            </w:pPr>
-            <w:r>
-              <w:t xml:space="preserve">-0.03</w:t>
-            </w:r>
-          </w:p>
-        </w:tc>
-        <w:tc>
-          <w:tcPr/>
-          <w:p>
-            <w:pPr>
-              <w:pStyle w:val="Compact"/>
-              <w:jc w:val="right"/>
-            </w:pPr>
-            <w:r>
-              <w:t xml:space="preserve">1.014 (0.986–1.042)</w:t>
-            </w:r>
-          </w:p>
-        </w:tc>
-        <w:tc>
-          <w:tcPr/>
-          <w:p>
-            <w:pPr>
-              <w:pStyle w:val="Compact"/>
-              <w:jc w:val="right"/>
-            </w:pPr>
-            <w:r>
-              <w:t xml:space="preserve">1.014 (0.986–1.042)</w:t>
-            </w:r>
-          </w:p>
-        </w:tc>
-        <w:tc>
-          <w:tcPr/>
-          <w:p>
-            <w:pPr>
-              <w:pStyle w:val="Compact"/>
-              <w:jc w:val="right"/>
-            </w:pPr>
-            <w:r>
-              <w:t xml:space="preserve">0.987 (0.948–1.028)</w:t>
+              <w:t xml:space="preserve">LTLA</w:t>
+            </w:r>
+          </w:p>
+        </w:tc>
+        <w:tc>
+          <w:tcPr/>
+          <w:p>
+            <w:pPr>
+              <w:pStyle w:val="Compact"/>
+              <w:jc w:val="right"/>
+            </w:pPr>
+            <w:r>
+              <w:t xml:space="preserve">Active-TB treatment (pyrazinamide DDD, including fixed-dose combinations; positive control)</w:t>
+            </w:r>
+          </w:p>
+        </w:tc>
+        <w:tc>
+          <w:tcPr/>
+          <w:p>
+            <w:pPr>
+              <w:pStyle w:val="Compact"/>
+              <w:jc w:val="right"/>
+            </w:pPr>
+            <w:r>
+              <w:t xml:space="preserve">1.154 (1.080–1.232)</w:t>
+            </w:r>
+          </w:p>
+        </w:tc>
+        <w:tc>
+          <w:tcPr/>
+          <w:p>
+            <w:pPr>
+              <w:pStyle w:val="Compact"/>
+              <w:jc w:val="right"/>
+            </w:pPr>
+            <w:r>
+              <w:t xml:space="preserve">1.039 (1.013–1.065)</w:t>
+            </w:r>
+          </w:p>
+        </w:tc>
+        <w:tc>
+          <w:tcPr/>
+          <w:p>
+            <w:pPr>
+              <w:pStyle w:val="Compact"/>
+              <w:jc w:val="right"/>
+            </w:pPr>
+            <w:r>
+              <w:t xml:space="preserve">0.40</w:t>
+            </w:r>
+          </w:p>
+        </w:tc>
+        <w:tc>
+          <w:tcPr/>
+          <w:p>
+            <w:pPr>
+              <w:pStyle w:val="Compact"/>
+              <w:jc w:val="right"/>
+            </w:pPr>
+            <w:r>
+              <w:t xml:space="preserve">1.000 (0.991–1.008)</w:t>
+            </w:r>
+          </w:p>
+        </w:tc>
+        <w:tc>
+          <w:tcPr/>
+          <w:p>
+            <w:pPr>
+              <w:pStyle w:val="Compact"/>
+              <w:jc w:val="right"/>
+            </w:pPr>
+            <w:r>
+              <w:t xml:space="preserve">1.000 (0.992–1.008)</w:t>
+            </w:r>
+          </w:p>
+        </w:tc>
+        <w:tc>
+          <w:tcPr/>
+          <w:p>
+            <w:pPr>
+              <w:pStyle w:val="Compact"/>
+              <w:jc w:val="right"/>
+            </w:pPr>
+            <w:r>
+              <w:t xml:space="preserve">0.995 (0.985–1.005)</w:t>
             </w:r>
           </w:p>
         </w:tc>
@@ -8708,79 +8708,79 @@
               <w:jc w:val="right"/>
             </w:pPr>
             <w:r>
-              <w:t xml:space="preserve">Active-TB treatment (pyrazinamide DDD, including fixed-dose combinations; positive control)</w:t>
-            </w:r>
-          </w:p>
-        </w:tc>
-        <w:tc>
-          <w:tcPr/>
-          <w:p>
-            <w:pPr>
-              <w:pStyle w:val="Compact"/>
-              <w:jc w:val="right"/>
-            </w:pPr>
-            <w:r>
-              <w:t xml:space="preserve">1.154 (1.080–1.232)</w:t>
-            </w:r>
-          </w:p>
-        </w:tc>
-        <w:tc>
-          <w:tcPr/>
-          <w:p>
-            <w:pPr>
-              <w:pStyle w:val="Compact"/>
-              <w:jc w:val="right"/>
-            </w:pPr>
-            <w:r>
-              <w:t xml:space="preserve">1.039 (1.013–1.065)</w:t>
-            </w:r>
-          </w:p>
-        </w:tc>
-        <w:tc>
-          <w:tcPr/>
-          <w:p>
-            <w:pPr>
-              <w:pStyle w:val="Compact"/>
-              <w:jc w:val="right"/>
-            </w:pPr>
-            <w:r>
-              <w:t xml:space="preserve">0.40</w:t>
-            </w:r>
-          </w:p>
-        </w:tc>
-        <w:tc>
-          <w:tcPr/>
-          <w:p>
-            <w:pPr>
-              <w:pStyle w:val="Compact"/>
-              <w:jc w:val="right"/>
-            </w:pPr>
-            <w:r>
-              <w:t xml:space="preserve">1.000 (0.991–1.008)</w:t>
-            </w:r>
-          </w:p>
-        </w:tc>
-        <w:tc>
-          <w:tcPr/>
-          <w:p>
-            <w:pPr>
-              <w:pStyle w:val="Compact"/>
-              <w:jc w:val="right"/>
-            </w:pPr>
-            <w:r>
-              <w:t xml:space="preserve">1.000 (0.992–1.008)</w:t>
-            </w:r>
-          </w:p>
-        </w:tc>
-        <w:tc>
-          <w:tcPr/>
-          <w:p>
-            <w:pPr>
-              <w:pStyle w:val="Compact"/>
-              <w:jc w:val="right"/>
-            </w:pPr>
-            <w:r>
-              <w:t xml:space="preserve">0.995 (0.985–1.005)</w:t>
+              <w:t xml:space="preserve">Rifamycin/isoniazid (active and latent TB, other infections)</w:t>
+            </w:r>
+          </w:p>
+        </w:tc>
+        <w:tc>
+          <w:tcPr/>
+          <w:p>
+            <w:pPr>
+              <w:pStyle w:val="Compact"/>
+              <w:jc w:val="right"/>
+            </w:pPr>
+            <w:r>
+              <w:t xml:space="preserve">1.065 (1.000–1.135)</w:t>
+            </w:r>
+          </w:p>
+        </w:tc>
+        <w:tc>
+          <w:tcPr/>
+          <w:p>
+            <w:pPr>
+              <w:pStyle w:val="Compact"/>
+              <w:jc w:val="right"/>
+            </w:pPr>
+            <w:r>
+              <w:t xml:space="preserve">1.038 (1.025–1.052)</w:t>
+            </w:r>
+          </w:p>
+        </w:tc>
+        <w:tc>
+          <w:tcPr/>
+          <w:p>
+            <w:pPr>
+              <w:pStyle w:val="Compact"/>
+              <w:jc w:val="right"/>
+            </w:pPr>
+            <w:r>
+              <w:t xml:space="preserve">0.39</w:t>
+            </w:r>
+          </w:p>
+        </w:tc>
+        <w:tc>
+          <w:tcPr/>
+          <w:p>
+            <w:pPr>
+              <w:pStyle w:val="Compact"/>
+              <w:jc w:val="right"/>
+            </w:pPr>
+            <w:r>
+              <w:t xml:space="preserve">1.004 (0.992–1.016)</w:t>
+            </w:r>
+          </w:p>
+        </w:tc>
+        <w:tc>
+          <w:tcPr/>
+          <w:p>
+            <w:pPr>
+              <w:pStyle w:val="Compact"/>
+              <w:jc w:val="right"/>
+            </w:pPr>
+            <w:r>
+              <w:t xml:space="preserve">1.004 (0.992–1.016)</w:t>
+            </w:r>
+          </w:p>
+        </w:tc>
+        <w:tc>
+          <w:tcPr/>
+          <w:p>
+            <w:pPr>
+              <w:pStyle w:val="Compact"/>
+              <w:jc w:val="right"/>
+            </w:pPr>
+            <w:r>
+              <w:t xml:space="preserve">1.018 (0.997–1.040)</w:t>
             </w:r>
           </w:p>
         </w:tc>
@@ -8806,79 +8806,79 @@
               <w:jc w:val="right"/>
             </w:pPr>
             <w:r>
-              <w:t xml:space="preserve">Rifamycin/isoniazid (active and latent TB, other infections)</w:t>
-            </w:r>
-          </w:p>
-        </w:tc>
-        <w:tc>
-          <w:tcPr/>
-          <w:p>
-            <w:pPr>
-              <w:pStyle w:val="Compact"/>
-              <w:jc w:val="right"/>
-            </w:pPr>
-            <w:r>
-              <w:t xml:space="preserve">1.065 (1.000–1.135)</w:t>
-            </w:r>
-          </w:p>
-        </w:tc>
-        <w:tc>
-          <w:tcPr/>
-          <w:p>
-            <w:pPr>
-              <w:pStyle w:val="Compact"/>
-              <w:jc w:val="right"/>
-            </w:pPr>
-            <w:r>
-              <w:t xml:space="preserve">1.038 (1.025–1.052)</w:t>
-            </w:r>
-          </w:p>
-        </w:tc>
-        <w:tc>
-          <w:tcPr/>
-          <w:p>
-            <w:pPr>
-              <w:pStyle w:val="Compact"/>
-              <w:jc w:val="right"/>
-            </w:pPr>
-            <w:r>
-              <w:t xml:space="preserve">0.39</w:t>
-            </w:r>
-          </w:p>
-        </w:tc>
-        <w:tc>
-          <w:tcPr/>
-          <w:p>
-            <w:pPr>
-              <w:pStyle w:val="Compact"/>
-              <w:jc w:val="right"/>
-            </w:pPr>
-            <w:r>
-              <w:t xml:space="preserve">1.004 (0.992–1.016)</w:t>
-            </w:r>
-          </w:p>
-        </w:tc>
-        <w:tc>
-          <w:tcPr/>
-          <w:p>
-            <w:pPr>
-              <w:pStyle w:val="Compact"/>
-              <w:jc w:val="right"/>
-            </w:pPr>
-            <w:r>
-              <w:t xml:space="preserve">1.004 (0.992–1.016)</w:t>
-            </w:r>
-          </w:p>
-        </w:tc>
-        <w:tc>
-          <w:tcPr/>
-          <w:p>
-            <w:pPr>
-              <w:pStyle w:val="Compact"/>
-              <w:jc w:val="right"/>
-            </w:pPr>
-            <w:r>
-              <w:t xml:space="preserve">1.018 (0.997–1.040)</w:t>
+              <w:t xml:space="preserve">TNF inhibitors</w:t>
+            </w:r>
+          </w:p>
+        </w:tc>
+        <w:tc>
+          <w:tcPr/>
+          <w:p>
+            <w:pPr>
+              <w:pStyle w:val="Compact"/>
+              <w:jc w:val="right"/>
+            </w:pPr>
+            <w:r>
+              <w:t xml:space="preserve">0.968 (0.927–1.012)</w:t>
+            </w:r>
+          </w:p>
+        </w:tc>
+        <w:tc>
+          <w:tcPr/>
+          <w:p>
+            <w:pPr>
+              <w:pStyle w:val="Compact"/>
+              <w:jc w:val="right"/>
+            </w:pPr>
+            <w:r>
+              <w:t xml:space="preserve">0.994 (0.979–1.010)</w:t>
+            </w:r>
+          </w:p>
+        </w:tc>
+        <w:tc>
+          <w:tcPr/>
+          <w:p>
+            <w:pPr>
+              <w:pStyle w:val="Compact"/>
+              <w:jc w:val="right"/>
+            </w:pPr>
+            <w:r>
+              <w:t xml:space="preserve">-0.06</w:t>
+            </w:r>
+          </w:p>
+        </w:tc>
+        <w:tc>
+          <w:tcPr/>
+          <w:p>
+            <w:pPr>
+              <w:pStyle w:val="Compact"/>
+              <w:jc w:val="right"/>
+            </w:pPr>
+            <w:r>
+              <w:t xml:space="preserve">0.992 (0.976–1.008)</w:t>
+            </w:r>
+          </w:p>
+        </w:tc>
+        <w:tc>
+          <w:tcPr/>
+          <w:p>
+            <w:pPr>
+              <w:pStyle w:val="Compact"/>
+              <w:jc w:val="right"/>
+            </w:pPr>
+            <w:r>
+              <w:t xml:space="preserve">0.992 (0.976–1.008)</w:t>
+            </w:r>
+          </w:p>
+        </w:tc>
+        <w:tc>
+          <w:tcPr/>
+          <w:p>
+            <w:pPr>
+              <w:pStyle w:val="Compact"/>
+              <w:jc w:val="right"/>
+            </w:pPr>
+            <w:r>
+              <w:t xml:space="preserve">0.975 (0.946–1.006)</w:t>
             </w:r>
           </w:p>
         </w:tc>
@@ -8904,79 +8904,79 @@
               <w:jc w:val="right"/>
             </w:pPr>
             <w:r>
-              <w:t xml:space="preserve">TNF inhibitors</w:t>
-            </w:r>
-          </w:p>
-        </w:tc>
-        <w:tc>
-          <w:tcPr/>
-          <w:p>
-            <w:pPr>
-              <w:pStyle w:val="Compact"/>
-              <w:jc w:val="right"/>
-            </w:pPr>
-            <w:r>
-              <w:t xml:space="preserve">0.968 (0.927–1.012)</w:t>
-            </w:r>
-          </w:p>
-        </w:tc>
-        <w:tc>
-          <w:tcPr/>
-          <w:p>
-            <w:pPr>
-              <w:pStyle w:val="Compact"/>
-              <w:jc w:val="right"/>
-            </w:pPr>
-            <w:r>
-              <w:t xml:space="preserve">0.994 (0.979–1.010)</w:t>
-            </w:r>
-          </w:p>
-        </w:tc>
-        <w:tc>
-          <w:tcPr/>
-          <w:p>
-            <w:pPr>
-              <w:pStyle w:val="Compact"/>
-              <w:jc w:val="right"/>
-            </w:pPr>
-            <w:r>
-              <w:t xml:space="preserve">-0.06</w:t>
-            </w:r>
-          </w:p>
-        </w:tc>
-        <w:tc>
-          <w:tcPr/>
-          <w:p>
-            <w:pPr>
-              <w:pStyle w:val="Compact"/>
-              <w:jc w:val="right"/>
-            </w:pPr>
-            <w:r>
-              <w:t xml:space="preserve">0.992 (0.976–1.008)</w:t>
-            </w:r>
-          </w:p>
-        </w:tc>
-        <w:tc>
-          <w:tcPr/>
-          <w:p>
-            <w:pPr>
-              <w:pStyle w:val="Compact"/>
-              <w:jc w:val="right"/>
-            </w:pPr>
-            <w:r>
-              <w:t xml:space="preserve">0.992 (0.976–1.008)</w:t>
-            </w:r>
-          </w:p>
-        </w:tc>
-        <w:tc>
-          <w:tcPr/>
-          <w:p>
-            <w:pPr>
-              <w:pStyle w:val="Compact"/>
-              <w:jc w:val="right"/>
-            </w:pPr>
-            <w:r>
-              <w:t xml:space="preserve">0.975 (0.946–1.006)</w:t>
+              <w:t xml:space="preserve">IL-6 inhibitors and abatacept</w:t>
+            </w:r>
+          </w:p>
+        </w:tc>
+        <w:tc>
+          <w:tcPr/>
+          <w:p>
+            <w:pPr>
+              <w:pStyle w:val="Compact"/>
+              <w:jc w:val="right"/>
+            </w:pPr>
+            <w:r>
+              <w:t xml:space="preserve">0.944 (0.906–0.984)</w:t>
+            </w:r>
+          </w:p>
+        </w:tc>
+        <w:tc>
+          <w:tcPr/>
+          <w:p>
+            <w:pPr>
+              <w:pStyle w:val="Compact"/>
+              <w:jc w:val="right"/>
+            </w:pPr>
+            <w:r>
+              <w:t xml:space="preserve">1.001 (0.991–1.011)</w:t>
+            </w:r>
+          </w:p>
+        </w:tc>
+        <w:tc>
+          <w:tcPr/>
+          <w:p>
+            <w:pPr>
+              <w:pStyle w:val="Compact"/>
+              <w:jc w:val="right"/>
+            </w:pPr>
+            <w:r>
+              <w:t xml:space="preserve">0.01</w:t>
+            </w:r>
+          </w:p>
+        </w:tc>
+        <w:tc>
+          <w:tcPr/>
+          <w:p>
+            <w:pPr>
+              <w:pStyle w:val="Compact"/>
+              <w:jc w:val="right"/>
+            </w:pPr>
+            <w:r>
+              <w:t xml:space="preserve">1.001 (0.993–1.010)</w:t>
+            </w:r>
+          </w:p>
+        </w:tc>
+        <w:tc>
+          <w:tcPr/>
+          <w:p>
+            <w:pPr>
+              <w:pStyle w:val="Compact"/>
+              <w:jc w:val="right"/>
+            </w:pPr>
+            <w:r>
+              <w:t xml:space="preserve">1.001 (0.993–1.010)</w:t>
+            </w:r>
+          </w:p>
+        </w:tc>
+        <w:tc>
+          <w:tcPr/>
+          <w:p>
+            <w:pPr>
+              <w:pStyle w:val="Compact"/>
+              <w:jc w:val="right"/>
+            </w:pPr>
+            <w:r>
+              <w:t xml:space="preserve">0.997 (0.981–1.013)</w:t>
             </w:r>
           </w:p>
         </w:tc>
@@ -9002,79 +9002,79 @@
               <w:jc w:val="right"/>
             </w:pPr>
             <w:r>
-              <w:t xml:space="preserve">IL-6 inhibitors and abatacept</w:t>
-            </w:r>
-          </w:p>
-        </w:tc>
-        <w:tc>
-          <w:tcPr/>
-          <w:p>
-            <w:pPr>
-              <w:pStyle w:val="Compact"/>
-              <w:jc w:val="right"/>
-            </w:pPr>
-            <w:r>
-              <w:t xml:space="preserve">0.944 (0.906–0.984)</w:t>
-            </w:r>
-          </w:p>
-        </w:tc>
-        <w:tc>
-          <w:tcPr/>
-          <w:p>
-            <w:pPr>
-              <w:pStyle w:val="Compact"/>
-              <w:jc w:val="right"/>
-            </w:pPr>
-            <w:r>
-              <w:t xml:space="preserve">1.001 (0.991–1.011)</w:t>
-            </w:r>
-          </w:p>
-        </w:tc>
-        <w:tc>
-          <w:tcPr/>
-          <w:p>
-            <w:pPr>
-              <w:pStyle w:val="Compact"/>
-              <w:jc w:val="right"/>
-            </w:pPr>
-            <w:r>
-              <w:t xml:space="preserve">0.01</w:t>
-            </w:r>
-          </w:p>
-        </w:tc>
-        <w:tc>
-          <w:tcPr/>
-          <w:p>
-            <w:pPr>
-              <w:pStyle w:val="Compact"/>
-              <w:jc w:val="right"/>
-            </w:pPr>
-            <w:r>
-              <w:t xml:space="preserve">1.001 (0.993–1.010)</w:t>
-            </w:r>
-          </w:p>
-        </w:tc>
-        <w:tc>
-          <w:tcPr/>
-          <w:p>
-            <w:pPr>
-              <w:pStyle w:val="Compact"/>
-              <w:jc w:val="right"/>
-            </w:pPr>
-            <w:r>
-              <w:t xml:space="preserve">1.001 (0.993–1.010)</w:t>
-            </w:r>
-          </w:p>
-        </w:tc>
-        <w:tc>
-          <w:tcPr/>
-          <w:p>
-            <w:pPr>
-              <w:pStyle w:val="Compact"/>
-              <w:jc w:val="right"/>
-            </w:pPr>
-            <w:r>
-              <w:t xml:space="preserve">0.997 (0.981–1.013)</w:t>
+              <w:t xml:space="preserve">JAK inhibitors (rheumatology)</w:t>
+            </w:r>
+          </w:p>
+        </w:tc>
+        <w:tc>
+          <w:tcPr/>
+          <w:p>
+            <w:pPr>
+              <w:pStyle w:val="Compact"/>
+              <w:jc w:val="right"/>
+            </w:pPr>
+            <w:r>
+              <w:t xml:space="preserve">0.948 (0.905–0.992)</w:t>
+            </w:r>
+          </w:p>
+        </w:tc>
+        <w:tc>
+          <w:tcPr/>
+          <w:p>
+            <w:pPr>
+              <w:pStyle w:val="Compact"/>
+              <w:jc w:val="right"/>
+            </w:pPr>
+            <w:r>
+              <w:t xml:space="preserve">0.994 (0.988–0.999)</w:t>
+            </w:r>
+          </w:p>
+        </w:tc>
+        <w:tc>
+          <w:tcPr/>
+          <w:p>
+            <w:pPr>
+              <w:pStyle w:val="Compact"/>
+              <w:jc w:val="right"/>
+            </w:pPr>
+            <w:r>
+              <w:t xml:space="preserve">-0.06</w:t>
+            </w:r>
+          </w:p>
+        </w:tc>
+        <w:tc>
+          <w:tcPr/>
+          <w:p>
+            <w:pPr>
+              <w:pStyle w:val="Compact"/>
+              <w:jc w:val="right"/>
+            </w:pPr>
+            <w:r>
+              <w:t xml:space="preserve">0.995 (0.989–1.002)</w:t>
+            </w:r>
+          </w:p>
+        </w:tc>
+        <w:tc>
+          <w:tcPr/>
+          <w:p>
+            <w:pPr>
+              <w:pStyle w:val="Compact"/>
+              <w:jc w:val="right"/>
+            </w:pPr>
+            <w:r>
+              <w:t xml:space="preserve">0.995 (0.988–1.003)</w:t>
+            </w:r>
+          </w:p>
+        </w:tc>
+        <w:tc>
+          <w:tcPr/>
+          <w:p>
+            <w:pPr>
+              <w:pStyle w:val="Compact"/>
+              <w:jc w:val="right"/>
+            </w:pPr>
+            <w:r>
+              <w:t xml:space="preserve">0.998 (0.984–1.012)</w:t>
             </w:r>
           </w:p>
         </w:tc>
@@ -9100,79 +9100,79 @@
               <w:jc w:val="right"/>
             </w:pPr>
             <w:r>
-              <w:t xml:space="preserve">JAK inhibitors (rheumatology)</w:t>
-            </w:r>
-          </w:p>
-        </w:tc>
-        <w:tc>
-          <w:tcPr/>
-          <w:p>
-            <w:pPr>
-              <w:pStyle w:val="Compact"/>
-              <w:jc w:val="right"/>
-            </w:pPr>
-            <w:r>
-              <w:t xml:space="preserve">0.948 (0.905–0.992)</w:t>
-            </w:r>
-          </w:p>
-        </w:tc>
-        <w:tc>
-          <w:tcPr/>
-          <w:p>
-            <w:pPr>
-              <w:pStyle w:val="Compact"/>
-              <w:jc w:val="right"/>
-            </w:pPr>
-            <w:r>
-              <w:t xml:space="preserve">0.994 (0.988–0.999)</w:t>
-            </w:r>
-          </w:p>
-        </w:tc>
-        <w:tc>
-          <w:tcPr/>
-          <w:p>
-            <w:pPr>
-              <w:pStyle w:val="Compact"/>
-              <w:jc w:val="right"/>
-            </w:pPr>
-            <w:r>
-              <w:t xml:space="preserve">-0.06</w:t>
-            </w:r>
-          </w:p>
-        </w:tc>
-        <w:tc>
-          <w:tcPr/>
-          <w:p>
-            <w:pPr>
-              <w:pStyle w:val="Compact"/>
-              <w:jc w:val="right"/>
-            </w:pPr>
-            <w:r>
-              <w:t xml:space="preserve">0.995 (0.989–1.002)</w:t>
-            </w:r>
-          </w:p>
-        </w:tc>
-        <w:tc>
-          <w:tcPr/>
-          <w:p>
-            <w:pPr>
-              <w:pStyle w:val="Compact"/>
-              <w:jc w:val="right"/>
-            </w:pPr>
-            <w:r>
-              <w:t xml:space="preserve">0.995 (0.988–1.003)</w:t>
-            </w:r>
-          </w:p>
-        </w:tc>
-        <w:tc>
-          <w:tcPr/>
-          <w:p>
-            <w:pPr>
-              <w:pStyle w:val="Compact"/>
-              <w:jc w:val="right"/>
-            </w:pPr>
-            <w:r>
-              <w:t xml:space="preserve">0.998 (0.984–1.012)</w:t>
+              <w:t xml:space="preserve">Rituximab</w:t>
+            </w:r>
+          </w:p>
+        </w:tc>
+        <w:tc>
+          <w:tcPr/>
+          <w:p>
+            <w:pPr>
+              <w:pStyle w:val="Compact"/>
+              <w:jc w:val="right"/>
+            </w:pPr>
+            <w:r>
+              <w:t xml:space="preserve">0.974 (0.929–1.021)</w:t>
+            </w:r>
+          </w:p>
+        </w:tc>
+        <w:tc>
+          <w:tcPr/>
+          <w:p>
+            <w:pPr>
+              <w:pStyle w:val="Compact"/>
+              <w:jc w:val="right"/>
+            </w:pPr>
+            <w:r>
+              <w:t xml:space="preserve">0.990 (0.976–1.004)</w:t>
+            </w:r>
+          </w:p>
+        </w:tc>
+        <w:tc>
+          <w:tcPr/>
+          <w:p>
+            <w:pPr>
+              <w:pStyle w:val="Compact"/>
+              <w:jc w:val="right"/>
+            </w:pPr>
+            <w:r>
+              <w:t xml:space="preserve">-0.10</w:t>
+            </w:r>
+          </w:p>
+        </w:tc>
+        <w:tc>
+          <w:tcPr/>
+          <w:p>
+            <w:pPr>
+              <w:pStyle w:val="Compact"/>
+              <w:jc w:val="right"/>
+            </w:pPr>
+            <w:r>
+              <w:t xml:space="preserve">1.001 (0.986–1.016)</w:t>
+            </w:r>
+          </w:p>
+        </w:tc>
+        <w:tc>
+          <w:tcPr/>
+          <w:p>
+            <w:pPr>
+              <w:pStyle w:val="Compact"/>
+              <w:jc w:val="right"/>
+            </w:pPr>
+            <w:r>
+              <w:t xml:space="preserve">1.001 (0.988–1.014)</w:t>
+            </w:r>
+          </w:p>
+        </w:tc>
+        <w:tc>
+          <w:tcPr/>
+          <w:p>
+            <w:pPr>
+              <w:pStyle w:val="Compact"/>
+              <w:jc w:val="right"/>
+            </w:pPr>
+            <w:r>
+              <w:t xml:space="preserve">1.005 (0.988–1.023)</w:t>
             </w:r>
           </w:p>
         </w:tc>
@@ -9198,79 +9198,79 @@
               <w:jc w:val="right"/>
             </w:pPr>
             <w:r>
-              <w:t xml:space="preserve">Rituximab</w:t>
-            </w:r>
-          </w:p>
-        </w:tc>
-        <w:tc>
-          <w:tcPr/>
-          <w:p>
-            <w:pPr>
-              <w:pStyle w:val="Compact"/>
-              <w:jc w:val="right"/>
-            </w:pPr>
-            <w:r>
-              <w:t xml:space="preserve">0.974 (0.929–1.021)</w:t>
-            </w:r>
-          </w:p>
-        </w:tc>
-        <w:tc>
-          <w:tcPr/>
-          <w:p>
-            <w:pPr>
-              <w:pStyle w:val="Compact"/>
-              <w:jc w:val="right"/>
-            </w:pPr>
-            <w:r>
-              <w:t xml:space="preserve">0.990 (0.976–1.004)</w:t>
-            </w:r>
-          </w:p>
-        </w:tc>
-        <w:tc>
-          <w:tcPr/>
-          <w:p>
-            <w:pPr>
-              <w:pStyle w:val="Compact"/>
-              <w:jc w:val="right"/>
-            </w:pPr>
-            <w:r>
-              <w:t xml:space="preserve">-0.10</w:t>
-            </w:r>
-          </w:p>
-        </w:tc>
-        <w:tc>
-          <w:tcPr/>
-          <w:p>
-            <w:pPr>
-              <w:pStyle w:val="Compact"/>
-              <w:jc w:val="right"/>
-            </w:pPr>
-            <w:r>
-              <w:t xml:space="preserve">1.001 (0.986–1.016)</w:t>
-            </w:r>
-          </w:p>
-        </w:tc>
-        <w:tc>
-          <w:tcPr/>
-          <w:p>
-            <w:pPr>
-              <w:pStyle w:val="Compact"/>
-              <w:jc w:val="right"/>
-            </w:pPr>
-            <w:r>
-              <w:t xml:space="preserve">1.001 (0.988–1.014)</w:t>
-            </w:r>
-          </w:p>
-        </w:tc>
-        <w:tc>
-          <w:tcPr/>
-          <w:p>
-            <w:pPr>
-              <w:pStyle w:val="Compact"/>
-              <w:jc w:val="right"/>
-            </w:pPr>
-            <w:r>
-              <w:t xml:space="preserve">1.005 (0.988–1.023)</w:t>
+              <w:t xml:space="preserve">Calcineurin/mTOR inhibitors</w:t>
+            </w:r>
+          </w:p>
+        </w:tc>
+        <w:tc>
+          <w:tcPr/>
+          <w:p>
+            <w:pPr>
+              <w:pStyle w:val="Compact"/>
+              <w:jc w:val="right"/>
+            </w:pPr>
+            <w:r>
+              <w:t xml:space="preserve">1.002 (0.959–1.046)</w:t>
+            </w:r>
+          </w:p>
+        </w:tc>
+        <w:tc>
+          <w:tcPr/>
+          <w:p>
+            <w:pPr>
+              <w:pStyle w:val="Compact"/>
+              <w:jc w:val="right"/>
+            </w:pPr>
+            <w:r>
+              <w:t xml:space="preserve">0.994 (0.985–1.003)</w:t>
+            </w:r>
+          </w:p>
+        </w:tc>
+        <w:tc>
+          <w:tcPr/>
+          <w:p>
+            <w:pPr>
+              <w:pStyle w:val="Compact"/>
+              <w:jc w:val="right"/>
+            </w:pPr>
+            <w:r>
+              <w:t xml:space="preserve">-0.07</w:t>
+            </w:r>
+          </w:p>
+        </w:tc>
+        <w:tc>
+          <w:tcPr/>
+          <w:p>
+            <w:pPr>
+              <w:pStyle w:val="Compact"/>
+              <w:jc w:val="right"/>
+            </w:pPr>
+            <w:r>
+              <w:t xml:space="preserve">1.008 (0.997–1.020)</w:t>
+            </w:r>
+          </w:p>
+        </w:tc>
+        <w:tc>
+          <w:tcPr/>
+          <w:p>
+            <w:pPr>
+              <w:pStyle w:val="Compact"/>
+              <w:jc w:val="right"/>
+            </w:pPr>
+            <w:r>
+              <w:t xml:space="preserve">1.008 (0.998–1.019)</w:t>
+            </w:r>
+          </w:p>
+        </w:tc>
+        <w:tc>
+          <w:tcPr/>
+          <w:p>
+            <w:pPr>
+              <w:pStyle w:val="Compact"/>
+              <w:jc w:val="right"/>
+            </w:pPr>
+            <w:r>
+              <w:t xml:space="preserve">0.983 (0.961–1.005)</w:t>
             </w:r>
           </w:p>
         </w:tc>
@@ -9296,79 +9296,79 @@
               <w:jc w:val="right"/>
             </w:pPr>
             <w:r>
-              <w:t xml:space="preserve">Calcineurin/mTOR inhibitors</w:t>
-            </w:r>
-          </w:p>
-        </w:tc>
-        <w:tc>
-          <w:tcPr/>
-          <w:p>
-            <w:pPr>
-              <w:pStyle w:val="Compact"/>
-              <w:jc w:val="right"/>
-            </w:pPr>
-            <w:r>
-              <w:t xml:space="preserve">1.002 (0.959–1.046)</w:t>
-            </w:r>
-          </w:p>
-        </w:tc>
-        <w:tc>
-          <w:tcPr/>
-          <w:p>
-            <w:pPr>
-              <w:pStyle w:val="Compact"/>
-              <w:jc w:val="right"/>
-            </w:pPr>
-            <w:r>
-              <w:t xml:space="preserve">0.994 (0.985–1.003)</w:t>
-            </w:r>
-          </w:p>
-        </w:tc>
-        <w:tc>
-          <w:tcPr/>
-          <w:p>
-            <w:pPr>
-              <w:pStyle w:val="Compact"/>
-              <w:jc w:val="right"/>
-            </w:pPr>
-            <w:r>
-              <w:t xml:space="preserve">-0.07</w:t>
-            </w:r>
-          </w:p>
-        </w:tc>
-        <w:tc>
-          <w:tcPr/>
-          <w:p>
-            <w:pPr>
-              <w:pStyle w:val="Compact"/>
-              <w:jc w:val="right"/>
-            </w:pPr>
-            <w:r>
-              <w:t xml:space="preserve">1.008 (0.997–1.020)</w:t>
-            </w:r>
-          </w:p>
-        </w:tc>
-        <w:tc>
-          <w:tcPr/>
-          <w:p>
-            <w:pPr>
-              <w:pStyle w:val="Compact"/>
-              <w:jc w:val="right"/>
-            </w:pPr>
-            <w:r>
-              <w:t xml:space="preserve">1.008 (0.998–1.019)</w:t>
-            </w:r>
-          </w:p>
-        </w:tc>
-        <w:tc>
-          <w:tcPr/>
-          <w:p>
-            <w:pPr>
-              <w:pStyle w:val="Compact"/>
-              <w:jc w:val="right"/>
-            </w:pPr>
-            <w:r>
-              <w:t xml:space="preserve">0.983 (0.961–1.005)</w:t>
+              <w:t xml:space="preserve">Antiproliferatives</w:t>
+            </w:r>
+          </w:p>
+        </w:tc>
+        <w:tc>
+          <w:tcPr/>
+          <w:p>
+            <w:pPr>
+              <w:pStyle w:val="Compact"/>
+              <w:jc w:val="right"/>
+            </w:pPr>
+            <w:r>
+              <w:t xml:space="preserve">0.983 (0.936–1.031)</w:t>
+            </w:r>
+          </w:p>
+        </w:tc>
+        <w:tc>
+          <w:tcPr/>
+          <w:p>
+            <w:pPr>
+              <w:pStyle w:val="Compact"/>
+              <w:jc w:val="right"/>
+            </w:pPr>
+            <w:r>
+              <w:t xml:space="preserve">0.997 (0.983–1.012)</w:t>
+            </w:r>
+          </w:p>
+        </w:tc>
+        <w:tc>
+          <w:tcPr/>
+          <w:p>
+            <w:pPr>
+              <w:pStyle w:val="Compact"/>
+              <w:jc w:val="right"/>
+            </w:pPr>
+            <w:r>
+              <w:t xml:space="preserve">-0.03</w:t>
+            </w:r>
+          </w:p>
+        </w:tc>
+        <w:tc>
+          <w:tcPr/>
+          <w:p>
+            <w:pPr>
+              <w:pStyle w:val="Compact"/>
+              <w:jc w:val="right"/>
+            </w:pPr>
+            <w:r>
+              <w:t xml:space="preserve">0.997 (0.982–1.013)</w:t>
+            </w:r>
+          </w:p>
+        </w:tc>
+        <w:tc>
+          <w:tcPr/>
+          <w:p>
+            <w:pPr>
+              <w:pStyle w:val="Compact"/>
+              <w:jc w:val="right"/>
+            </w:pPr>
+            <w:r>
+              <w:t xml:space="preserve">0.997 (0.980–1.015)</w:t>
+            </w:r>
+          </w:p>
+        </w:tc>
+        <w:tc>
+          <w:tcPr/>
+          <w:p>
+            <w:pPr>
+              <w:pStyle w:val="Compact"/>
+              <w:jc w:val="right"/>
+            </w:pPr>
+            <w:r>
+              <w:t xml:space="preserve">0.993 (0.974–1.012)</w:t>
             </w:r>
           </w:p>
         </w:tc>
@@ -9394,104 +9394,6 @@
               <w:jc w:val="right"/>
             </w:pPr>
             <w:r>
-              <w:t xml:space="preserve">Antiproliferatives</w:t>
-            </w:r>
-          </w:p>
-        </w:tc>
-        <w:tc>
-          <w:tcPr/>
-          <w:p>
-            <w:pPr>
-              <w:pStyle w:val="Compact"/>
-              <w:jc w:val="right"/>
-            </w:pPr>
-            <w:r>
-              <w:t xml:space="preserve">0.983 (0.936–1.031)</w:t>
-            </w:r>
-          </w:p>
-        </w:tc>
-        <w:tc>
-          <w:tcPr/>
-          <w:p>
-            <w:pPr>
-              <w:pStyle w:val="Compact"/>
-              <w:jc w:val="right"/>
-            </w:pPr>
-            <w:r>
-              <w:t xml:space="preserve">0.997 (0.983–1.012)</w:t>
-            </w:r>
-          </w:p>
-        </w:tc>
-        <w:tc>
-          <w:tcPr/>
-          <w:p>
-            <w:pPr>
-              <w:pStyle w:val="Compact"/>
-              <w:jc w:val="right"/>
-            </w:pPr>
-            <w:r>
-              <w:t xml:space="preserve">-0.03</w:t>
-            </w:r>
-          </w:p>
-        </w:tc>
-        <w:tc>
-          <w:tcPr/>
-          <w:p>
-            <w:pPr>
-              <w:pStyle w:val="Compact"/>
-              <w:jc w:val="right"/>
-            </w:pPr>
-            <w:r>
-              <w:t xml:space="preserve">0.997 (0.982–1.013)</w:t>
-            </w:r>
-          </w:p>
-        </w:tc>
-        <w:tc>
-          <w:tcPr/>
-          <w:p>
-            <w:pPr>
-              <w:pStyle w:val="Compact"/>
-              <w:jc w:val="right"/>
-            </w:pPr>
-            <w:r>
-              <w:t xml:space="preserve">0.997 (0.980–1.015)</w:t>
-            </w:r>
-          </w:p>
-        </w:tc>
-        <w:tc>
-          <w:tcPr/>
-          <w:p>
-            <w:pPr>
-              <w:pStyle w:val="Compact"/>
-              <w:jc w:val="right"/>
-            </w:pPr>
-            <w:r>
-              <w:t xml:space="preserve">0.993 (0.974–1.012)</w:t>
-            </w:r>
-          </w:p>
-        </w:tc>
-      </w:tr>
-      <w:tr>
-        <w:tc>
-          <w:tcPr/>
-          <w:p>
-            <w:pPr>
-              <w:pStyle w:val="Compact"/>
-              <w:jc w:val="left"/>
-            </w:pPr>
-            <w:r>
-              <w:t xml:space="preserve">LTLA</w:t>
-            </w:r>
-          </w:p>
-        </w:tc>
-        <w:tc>
-          <w:tcPr/>
-          <w:p>
-            <w:pPr>
-              <w:pStyle w:val="Compact"/>
-              <w:jc w:val="right"/>
-            </w:pPr>
-            <w:r>
               <w:t xml:space="preserve">Systemic glucocorticoids without dexamethasone/hydrocortisone (prednisolone-equivalent mg)</w:t>
             </w:r>
           </w:p>
@@ -9565,104 +9467,6 @@
             </w:pPr>
             <w:r>
               <w:t xml:space="preserve">0.986 (0.952–1.020)</w:t>
-            </w:r>
-          </w:p>
-        </w:tc>
-      </w:tr>
-      <w:tr>
-        <w:tc>
-          <w:tcPr/>
-          <w:p>
-            <w:pPr>
-              <w:pStyle w:val="Compact"/>
-              <w:jc w:val="left"/>
-            </w:pPr>
-            <w:r>
-              <w:t xml:space="preserve">LTLA</w:t>
-            </w:r>
-          </w:p>
-        </w:tc>
-        <w:tc>
-          <w:tcPr/>
-          <w:p>
-            <w:pPr>
-              <w:pStyle w:val="Compact"/>
-              <w:jc w:val="right"/>
-            </w:pPr>
-            <w:r>
-              <w:t xml:space="preserve">Systemic glucocorticoids, oral forms only (sensitivity)</w:t>
-            </w:r>
-          </w:p>
-        </w:tc>
-        <w:tc>
-          <w:tcPr/>
-          <w:p>
-            <w:pPr>
-              <w:pStyle w:val="Compact"/>
-              <w:jc w:val="right"/>
-            </w:pPr>
-            <w:r>
-              <w:t xml:space="preserve">0.974 (0.943–1.006)</w:t>
-            </w:r>
-          </w:p>
-        </w:tc>
-        <w:tc>
-          <w:tcPr/>
-          <w:p>
-            <w:pPr>
-              <w:pStyle w:val="Compact"/>
-              <w:jc w:val="right"/>
-            </w:pPr>
-            <w:r>
-              <w:t xml:space="preserve">1.001 (0.982–1.019)</w:t>
-            </w:r>
-          </w:p>
-        </w:tc>
-        <w:tc>
-          <w:tcPr/>
-          <w:p>
-            <w:pPr>
-              <w:pStyle w:val="Compact"/>
-              <w:jc w:val="right"/>
-            </w:pPr>
-            <w:r>
-              <w:t xml:space="preserve">0.01</w:t>
-            </w:r>
-          </w:p>
-        </w:tc>
-        <w:tc>
-          <w:tcPr/>
-          <w:p>
-            <w:pPr>
-              <w:pStyle w:val="Compact"/>
-              <w:jc w:val="right"/>
-            </w:pPr>
-            <w:r>
-              <w:t xml:space="preserve">1.015 (0.994–1.036)</w:t>
-            </w:r>
-          </w:p>
-        </w:tc>
-        <w:tc>
-          <w:tcPr/>
-          <w:p>
-            <w:pPr>
-              <w:pStyle w:val="Compact"/>
-              <w:jc w:val="right"/>
-            </w:pPr>
-            <w:r>
-              <w:t xml:space="preserve">1.015 (0.994–1.037)</w:t>
-            </w:r>
-          </w:p>
-        </w:tc>
-        <w:tc>
-          <w:tcPr/>
-          <w:p>
-            <w:pPr>
-              <w:pStyle w:val="Compact"/>
-              <w:jc w:val="right"/>
-            </w:pPr>
-            <w:r>
-              <w:t xml:space="preserve">0.976 (0.939–1.014)</w:t>
             </w:r>
           </w:p>
         </w:tc>
@@ -13233,7 +13037,7 @@
         <w:pStyle w:val="FirstParagraph"/>
       </w:pPr>
       <w:r>
-        <w:t xml:space="preserve">All inputs are publicly available (NHSBSA Open Data Portal: English Prescribing Dataset and Secondary Care Medicines Data; NHS Digital practice-level prescribing and registered patients by LSOA; UKHSA TB reports and Fingertips; OHID acute trust catchment populations; ONS/Nomis; Home Office asylum statistics; NHS England ODS; MHCLG English Indices of Deprivation). Code, processed datasets and outputs: https://github.com/drcjar/tb-prescribing-england. Data were obtained in September 2026: the EPD and SCMD through the NHSBSA API (all SCMD months analysed were final data, three of them from an earlier, since-retired release), and the NHS England ODS epraccur file, practice registration releases (April 2014–2024), OHID acute trust catchments (2024 catchment year), and the UKHSA TB in England 2025 and regional 2024 supplementary tables as published at that time. These portals revise data between releases.</w:t>
+        <w:t xml:space="preserve">All inputs are publicly available (NHSBSA Open Data Portal: English Prescribing Dataset and Secondary Care Medicines Data; NHS Digital practice-level prescribing and registered patients by LSOA; UKHSA TB reports and Fingertips; OHID acute trust catchment populations; ONS/Nomis; Home Office asylum statistics; NHS England ODS; MHCLG English Indices of Deprivation). Code, processed datasets and outputs: https://github.com/drcjar/tb-prescribing-england. Data were obtained in September 2026: the EPD and SCMD through the NHSBSA API (SCMD months from April 2019 were final data; January–March 2019 came from an earlier, since-retired release whose status could not be confirmed), and the NHS England ODS epraccur file, practice registration releases (April 2014–2024), OHID acute trust catchments (2024 catchment year), and the UKHSA TB in England 2025 and regional 2024 supplementary tables as published at that time. These portals revise data between releases.</w:t>
       </w:r>
     </w:p>
     <w:bookmarkEnd w:id="63"/>
@@ -21483,7 +21287,7 @@
         <w:pStyle w:val="BodyText"/>
       </w:pPr>
       <w:r>
-        <w:t xml:space="preserve">Within the simulation, replicate SEs matched the spread of null estimates, so the test was approximately calibrated (slightly anti-conservative). Real-data SEs were larger than in the simulation because permuting exposure trajectories across areas breaks their alignment with each area’s own notification trends; simulated power is therefore optimistic. Analytic power uses the median simulated estimate as the effect and the real-data SE.</w:t>
+        <w:t xml:space="preserve">Within the simulation, replicate SEs matched the spread of null estimates, so the test was approximately calibrated (slightly anti-conservative). Real-data SEs were larger than in the simulation, probably because permuting exposure trajectories across areas breaks their alignment with each area’s own notification trends; simulated power is therefore optimistic. Analytic power uses the median simulated estimate as the effect and the real-data SE.</w:t>
       </w:r>
     </w:p>
     <w:p>

</xml_diff>

<commit_message>
Remove reference verification notes from the reference list; fix two wrapped lines parsed as list items
Co-Authored-By: Claude Opus 5 <noreply@anthropic.com>
Claude-Session: https://claude.ai/code/session_01PkNMwEKitkq1tP96RKxYsX
</commit_message>
<xml_diff>
--- a/paper/manuscript.docx
+++ b/paper/manuscript.docx
@@ -2410,19 +2410,19 @@
         <w:pStyle w:val="BodyText"/>
       </w:pPr>
       <w:r>
-        <w:t xml:space="preserve">Assigning each practice to the district containing its postcode (ONS Postcode Directory, August</w:t>
-      </w:r>
-      <w:r>
-        <w:t xml:space="preserve"> </w:t>
-      </w:r>
-      <w:r>
-        <w:t xml:space="preserve">2025) was a sensitivity analysis. In</w:t>
-      </w:r>
-      <w:r>
-        <w:t xml:space="preserve"> </w:t>
-      </w:r>
-      <w:r>
-        <w:t xml:space="preserve">2024, 7.3% of registered patients lived outside the district of their practice.</w:t>
+        <w:t xml:space="preserve">Assigning each practice to the district containing its postcode was a sensitivity analysis (ONS</w:t>
+      </w:r>
+      <w:r>
+        <w:t xml:space="preserve"> </w:t>
+      </w:r>
+      <w:r>
+        <w:t xml:space="preserve">Postcode Directory, August 2025). In 2024, 7.3% of registered patients lived outside the district</w:t>
+      </w:r>
+      <w:r>
+        <w:t xml:space="preserve"> </w:t>
+      </w:r>
+      <w:r>
+        <w:t xml:space="preserve">of their practice.</w:t>
       </w:r>
     </w:p>
     <w:p>
@@ -13755,7 +13755,7 @@
         </w:numPr>
       </w:pPr>
       <w:r>
-        <w:t xml:space="preserve">National Institute for Health and Care Excellence. Tuberculosis. NICE guideline [NG33]. London: NICE; published 13 January 2016, last updated 16 February 2024. https://www.nice.org.uk/guidance/ng33 [dates confirmed from search results only; nice.org.uk returned HTTP 403 to automated access. The wording of the LTBI testing recommendation still needs checking by hand against the current text.]</w:t>
+        <w:t xml:space="preserve">National Institute for Health and Care Excellence. Tuberculosis. NICE guideline [NG33]. London: NICE; published 13 January 2016, last updated 16 February 2024. https://www.nice.org.uk/guidance/ng33</w:t>
       </w:r>
     </w:p>
     <w:p>
@@ -14031,37 +14031,7 @@
         </w:numPr>
       </w:pPr>
       <w:r>
-        <w:t xml:space="preserve">UK Health Security Agency. Tuberculosis in England: 2021 report (presenting data to end of 2020). London: UKHSA; 2021 (added to GOV.UK 28 October 2021; corrected PDF 30 March 2022). https://assets.publishing.service.gov.uk/media/62441310e90e075f124018e8/TB_annual-report-2021.pdf [The PDF reports</w:t>
-      </w:r>
-      <w:r>
-        <w:t xml:space="preserve"> </w:t>
-      </w:r>
-      <w:r>
-        <w:t xml:space="preserve">“</w:t>
-      </w:r>
-      <w:r>
-        <w:t xml:space="preserve">In 2020, 4,125 people were notified with TB in England, with a rate of 7.3 per 100,000 population</w:t>
-      </w:r>
-      <w:r>
-        <w:t xml:space="preserve">”</w:t>
-      </w:r>
-      <w:r>
-        <w:t xml:space="preserve">. Its suggested citation is</w:t>
-      </w:r>
-      <w:r>
-        <w:t xml:space="preserve"> </w:t>
-      </w:r>
-      <w:r>
-        <w:t xml:space="preserve">“</w:t>
-      </w:r>
-      <w:r>
-        <w:t xml:space="preserve">UK Health Security Agency. (2021) Tuberculosis in England: 2020. UK Health Security Agency, London.</w:t>
-      </w:r>
-      <w:r>
-        <w:t xml:space="preserve">”</w:t>
-      </w:r>
-      <w:r>
-        <w:t xml:space="preserve">]</w:t>
+        <w:t xml:space="preserve">UK Health Security Agency. Tuberculosis in England: 2021 report (presenting data to end of 2020). London: UKHSA; 2021 (added to GOV.UK 28 October 2021; corrected PDF 30 March 2022). https://assets.publishing.service.gov.uk/media/62441310e90e075f124018e8/TB_annual-report-2021.pdf</w:t>
       </w:r>
     </w:p>
     <w:p>
@@ -14073,22 +14043,7 @@
         </w:numPr>
       </w:pPr>
       <w:r>
-        <w:t xml:space="preserve">UK Health Security Agency. Tuberculosis in England: 2025 report (data up to end of 2024), chapter 1 and supplementary tables 5, 12 and 22; and TB regional reports 2024, supplementary data. London: UKHSA; first published 8 October 2025 (GOV.UK change history; the content API timestamp reads 9 October 2025 BST), last updated 15 July 2026. https://www.gov.uk/government/publications/tuberculosis-in-england-2025-report [the GOV.UK page title reads</w:t>
-      </w:r>
-      <w:r>
-        <w:t xml:space="preserve"> </w:t>
-      </w:r>
-      <w:r>
-        <w:t xml:space="preserve">“</w:t>
-      </w:r>
-      <w:r>
-        <w:t xml:space="preserve">Tuberculosis in England, 2025 report</w:t>
-      </w:r>
-      <w:r>
-        <w:t xml:space="preserve">”</w:t>
-      </w:r>
-      <w:r>
-        <w:t xml:space="preserve">. The specific supplementary table numbers and the regional reports publication were not individually checked.]</w:t>
+        <w:t xml:space="preserve">UK Health Security Agency. Tuberculosis in England: 2025 report (data up to end of 2024), chapter 1 and supplementary tables 5, 12 and 22; and TB regional reports 2024, supplementary data. London: UKHSA; first published 8 October 2025 (GOV.UK change history; the content API timestamp reads 9 October 2025 BST), last updated 15 July 2026. https://www.gov.uk/government/publications/tuberculosis-in-england-2025-report</w:t>
       </w:r>
     </w:p>
     <w:p>
@@ -14100,22 +14055,7 @@
         </w:numPr>
       </w:pPr>
       <w:r>
-        <w:t xml:space="preserve">UK Health Security Agency. Tuberculosis notifications in England stabilise in 2025. News story, 29 January 2026. https://www.gov.uk/government/news/tuberculosis-notifications-in-england-stabilise-in-2025 [confirmed:</w:t>
-      </w:r>
-      <w:r>
-        <w:t xml:space="preserve"> </w:t>
-      </w:r>
-      <w:r>
-        <w:t xml:space="preserve">“</w:t>
-      </w:r>
-      <w:r>
-        <w:t xml:space="preserve">5,424 people notified compared to 5,487 in 2024 – a decrease of 1.1%</w:t>
-      </w:r>
-      <w:r>
-        <w:t xml:space="preserve">”</w:t>
-      </w:r>
-      <w:r>
-        <w:t xml:space="preserve">; rate 9.4 per 100,000]</w:t>
+        <w:t xml:space="preserve">UK Health Security Agency. Tuberculosis notifications in England stabilise in 2025. News story, 29 January 2026. https://www.gov.uk/government/news/tuberculosis-notifications-in-england-stabilise-in-2025</w:t>
       </w:r>
     </w:p>
     <w:p>

</xml_diff>